<commit_message>
MAAMC0101DTM 프로그램 코드 컬럼명 AVTV_PGM_CD → ATVT_PGM_FUND_CD
Co-Authored-By: Claude Opus 5.5 <noreply@anthropic.com>
Claude-Session: https://claude.ai/code/session_01FNjiyZhRgWLtzUkmC9rnkc
</commit_message>
<xml_diff>
--- a/deliver/01_SQL.docx
+++ b/deliver/01_SQL.docx
@@ -63,7 +63,7 @@
           <w:sz w:val="20"/>
           <w:szCs w:val="20"/>
         </w:rPr>
-        <w:t xml:space="preserve">펀드 마스터. FEIAI0488NTA(펀드코드·펀드명·빈티지·통화) + MAAMC0101DTM(AVTV_PGM_CD → 자산군). Oracle (+) 외부조인</w:t>
+        <w:t xml:space="preserve">펀드 마스터. FEIAI0488NTA(펀드코드·펀드명·빈티지·통화) + MAAMC0101DTM(ATVT_PGM_FUND_CD → 자산군). Oracle (+) 외부조인</w:t>
       </w:r>
     </w:p>
     <w:p>
@@ -146,23 +146,23 @@
           <w:sz w:val="17"/>
           <w:szCs w:val="17"/>
         </w:rPr>
-        <w:t xml:space="preserve">     MAAMC0101DTM  FUND_CD(펀드코드), AVTV_PGM_CD(액티브 프로그램 코드)</w:t>
-      </w:r>
-    </w:p>
-    <w:p>
-      <w:pPr>
-        <w:shd w:fill="F3F5F8" w:color="auto" w:val="clear"/>
-        <w:spacing w:after="0" w:before="0" w:line="240"/>
-        <w:ind w:left="120" w:right="120"/>
-      </w:pPr>
-      <w:r>
-        <w:rPr>
-          <w:rFonts w:ascii="Consolas" w:cs="Consolas" w:eastAsia="Malgun Gothic" w:hAnsi="Consolas"/>
-          <w:color w:val="111827"/>
-          <w:sz w:val="17"/>
-          <w:szCs w:val="17"/>
-        </w:rPr>
-        <w:t xml:space="preserve">   자산군: AVTV_PGM_CD 앞 3자리 XPV 사모벤처, XRE 부동산, XIF 인프라</w:t>
+        <w:t xml:space="preserve">     MAAMC0101DTM  FUND_CD(펀드코드), ATVT_PGM_FUND_CD(액티브 프로그램 코드)</w:t>
+      </w:r>
+    </w:p>
+    <w:p>
+      <w:pPr>
+        <w:shd w:fill="F3F5F8" w:color="auto" w:val="clear"/>
+        <w:spacing w:after="0" w:before="0" w:line="240"/>
+        <w:ind w:left="120" w:right="120"/>
+      </w:pPr>
+      <w:r>
+        <w:rPr>
+          <w:rFonts w:ascii="Consolas" w:cs="Consolas" w:eastAsia="Malgun Gothic" w:hAnsi="Consolas"/>
+          <w:color w:val="111827"/>
+          <w:sz w:val="17"/>
+          <w:szCs w:val="17"/>
+        </w:rPr>
+        <w:t xml:space="preserve">   자산군: ATVT_PGM_FUND_CD 앞 3자리 XPV 사모벤처, XRE 부동산, XIF 인프라</w:t>
       </w:r>
     </w:p>
     <w:p>
@@ -210,135 +210,135 @@
           <w:sz w:val="17"/>
           <w:szCs w:val="17"/>
         </w:rPr>
-        <w:t xml:space="preserve">SELECT a.NPS_FUND_CD                                        AS fund_cd</w:t>
-      </w:r>
-    </w:p>
-    <w:p>
-      <w:pPr>
-        <w:shd w:fill="F3F5F8" w:color="auto" w:val="clear"/>
-        <w:spacing w:after="0" w:before="0" w:line="240"/>
-        <w:ind w:left="120" w:right="120"/>
-      </w:pPr>
-      <w:r>
-        <w:rPr>
-          <w:rFonts w:ascii="Consolas" w:cs="Consolas" w:eastAsia="Malgun Gothic" w:hAnsi="Consolas"/>
-          <w:color w:val="111827"/>
-          <w:sz w:val="17"/>
-          <w:szCs w:val="17"/>
-        </w:rPr>
-        <w:t xml:space="preserve">     , NVL(a.DEAL_NM, a.NPS_FUND_CD)                        AS fund_nm</w:t>
-      </w:r>
-    </w:p>
-    <w:p>
-      <w:pPr>
-        <w:shd w:fill="F3F5F8" w:color="auto" w:val="clear"/>
-        <w:spacing w:after="0" w:before="0" w:line="240"/>
-        <w:ind w:left="120" w:right="120"/>
-      </w:pPr>
-      <w:r>
-        <w:rPr>
-          <w:rFonts w:ascii="Consolas" w:cs="Consolas" w:eastAsia="Malgun Gothic" w:hAnsi="Consolas"/>
-          <w:color w:val="111827"/>
-          <w:sz w:val="17"/>
-          <w:szCs w:val="17"/>
-        </w:rPr>
-        <w:t xml:space="preserve">     , DECODE(SUBSTR(m.AVTV_PGM_CD, 1, 3), 'XPV', '사모벤처'</w:t>
-      </w:r>
-    </w:p>
-    <w:p>
-      <w:pPr>
-        <w:shd w:fill="F3F5F8" w:color="auto" w:val="clear"/>
-        <w:spacing w:after="0" w:before="0" w:line="240"/>
-        <w:ind w:left="120" w:right="120"/>
-      </w:pPr>
-      <w:r>
-        <w:rPr>
-          <w:rFonts w:ascii="Consolas" w:cs="Consolas" w:eastAsia="Malgun Gothic" w:hAnsi="Consolas"/>
-          <w:color w:val="111827"/>
-          <w:sz w:val="17"/>
-          <w:szCs w:val="17"/>
-        </w:rPr>
-        <w:t xml:space="preserve">                                        , 'XRE', '부동산'</w:t>
-      </w:r>
-    </w:p>
-    <w:p>
-      <w:pPr>
-        <w:shd w:fill="F3F5F8" w:color="auto" w:val="clear"/>
-        <w:spacing w:after="0" w:before="0" w:line="240"/>
-        <w:ind w:left="120" w:right="120"/>
-      </w:pPr>
-      <w:r>
-        <w:rPr>
-          <w:rFonts w:ascii="Consolas" w:cs="Consolas" w:eastAsia="Malgun Gothic" w:hAnsi="Consolas"/>
-          <w:color w:val="111827"/>
-          <w:sz w:val="17"/>
-          <w:szCs w:val="17"/>
-        </w:rPr>
-        <w:t xml:space="preserve">                                        , 'XIF', '인프라'</w:t>
-      </w:r>
-    </w:p>
-    <w:p>
-      <w:pPr>
-        <w:shd w:fill="F3F5F8" w:color="auto" w:val="clear"/>
-        <w:spacing w:after="0" w:before="0" w:line="240"/>
-        <w:ind w:left="120" w:right="120"/>
-      </w:pPr>
-      <w:r>
-        <w:rPr>
-          <w:rFonts w:ascii="Consolas" w:cs="Consolas" w:eastAsia="Malgun Gothic" w:hAnsi="Consolas"/>
-          <w:color w:val="111827"/>
-          <w:sz w:val="17"/>
-          <w:szCs w:val="17"/>
-        </w:rPr>
-        <w:t xml:space="preserve">                                        , '미분류')          AS asset_cls</w:t>
-      </w:r>
-    </w:p>
-    <w:p>
-      <w:pPr>
-        <w:shd w:fill="F3F5F8" w:color="auto" w:val="clear"/>
-        <w:spacing w:after="0" w:before="0" w:line="240"/>
-        <w:ind w:left="120" w:right="120"/>
-      </w:pPr>
-      <w:r>
-        <w:rPr>
-          <w:rFonts w:ascii="Consolas" w:cs="Consolas" w:eastAsia="Malgun Gothic" w:hAnsi="Consolas"/>
-          <w:color w:val="111827"/>
-          <w:sz w:val="17"/>
-          <w:szCs w:val="17"/>
-        </w:rPr>
-        <w:t xml:space="preserve">     , m.AVTV_PGM_CD                                        AS pgm_cd</w:t>
-      </w:r>
-    </w:p>
-    <w:p>
-      <w:pPr>
-        <w:shd w:fill="F3F5F8" w:color="auto" w:val="clear"/>
-        <w:spacing w:after="0" w:before="0" w:line="240"/>
-        <w:ind w:left="120" w:right="120"/>
-      </w:pPr>
-      <w:r>
-        <w:rPr>
-          <w:rFonts w:ascii="Consolas" w:cs="Consolas" w:eastAsia="Malgun Gothic" w:hAnsi="Consolas"/>
-          <w:color w:val="111827"/>
-          <w:sz w:val="17"/>
-          <w:szCs w:val="17"/>
-        </w:rPr>
-        <w:t xml:space="preserve">     , NVL(UPPER(a.CURR_CD), 'KRW')                         AS ccy</w:t>
-      </w:r>
-    </w:p>
-    <w:p>
-      <w:pPr>
-        <w:shd w:fill="F3F5F8" w:color="auto" w:val="clear"/>
-        <w:spacing w:after="0" w:before="0" w:line="240"/>
-        <w:ind w:left="120" w:right="120"/>
-      </w:pPr>
-      <w:r>
-        <w:rPr>
-          <w:rFonts w:ascii="Consolas" w:cs="Consolas" w:eastAsia="Malgun Gothic" w:hAnsi="Consolas"/>
-          <w:color w:val="111827"/>
-          <w:sz w:val="17"/>
-          <w:szCs w:val="17"/>
-        </w:rPr>
-        <w:t xml:space="preserve">     , a.VNTG_YR                                            AS vintage_yr</w:t>
+        <w:t xml:space="preserve">SELECT a.NPS_FUND_CD                                             AS fund_cd</w:t>
+      </w:r>
+    </w:p>
+    <w:p>
+      <w:pPr>
+        <w:shd w:fill="F3F5F8" w:color="auto" w:val="clear"/>
+        <w:spacing w:after="0" w:before="0" w:line="240"/>
+        <w:ind w:left="120" w:right="120"/>
+      </w:pPr>
+      <w:r>
+        <w:rPr>
+          <w:rFonts w:ascii="Consolas" w:cs="Consolas" w:eastAsia="Malgun Gothic" w:hAnsi="Consolas"/>
+          <w:color w:val="111827"/>
+          <w:sz w:val="17"/>
+          <w:szCs w:val="17"/>
+        </w:rPr>
+        <w:t xml:space="preserve">     , NVL(a.DEAL_NM, a.NPS_FUND_CD)                             AS fund_nm</w:t>
+      </w:r>
+    </w:p>
+    <w:p>
+      <w:pPr>
+        <w:shd w:fill="F3F5F8" w:color="auto" w:val="clear"/>
+        <w:spacing w:after="0" w:before="0" w:line="240"/>
+        <w:ind w:left="120" w:right="120"/>
+      </w:pPr>
+      <w:r>
+        <w:rPr>
+          <w:rFonts w:ascii="Consolas" w:cs="Consolas" w:eastAsia="Malgun Gothic" w:hAnsi="Consolas"/>
+          <w:color w:val="111827"/>
+          <w:sz w:val="17"/>
+          <w:szCs w:val="17"/>
+        </w:rPr>
+        <w:t xml:space="preserve">     , DECODE(SUBSTR(m.ATVT_PGM_FUND_CD, 1, 3), 'XPV', '사모벤처'</w:t>
+      </w:r>
+    </w:p>
+    <w:p>
+      <w:pPr>
+        <w:shd w:fill="F3F5F8" w:color="auto" w:val="clear"/>
+        <w:spacing w:after="0" w:before="0" w:line="240"/>
+        <w:ind w:left="120" w:right="120"/>
+      </w:pPr>
+      <w:r>
+        <w:rPr>
+          <w:rFonts w:ascii="Consolas" w:cs="Consolas" w:eastAsia="Malgun Gothic" w:hAnsi="Consolas"/>
+          <w:color w:val="111827"/>
+          <w:sz w:val="17"/>
+          <w:szCs w:val="17"/>
+        </w:rPr>
+        <w:t xml:space="preserve">                                             , 'XRE', '부동산'</w:t>
+      </w:r>
+    </w:p>
+    <w:p>
+      <w:pPr>
+        <w:shd w:fill="F3F5F8" w:color="auto" w:val="clear"/>
+        <w:spacing w:after="0" w:before="0" w:line="240"/>
+        <w:ind w:left="120" w:right="120"/>
+      </w:pPr>
+      <w:r>
+        <w:rPr>
+          <w:rFonts w:ascii="Consolas" w:cs="Consolas" w:eastAsia="Malgun Gothic" w:hAnsi="Consolas"/>
+          <w:color w:val="111827"/>
+          <w:sz w:val="17"/>
+          <w:szCs w:val="17"/>
+        </w:rPr>
+        <w:t xml:space="preserve">                                             , 'XIF', '인프라'</w:t>
+      </w:r>
+    </w:p>
+    <w:p>
+      <w:pPr>
+        <w:shd w:fill="F3F5F8" w:color="auto" w:val="clear"/>
+        <w:spacing w:after="0" w:before="0" w:line="240"/>
+        <w:ind w:left="120" w:right="120"/>
+      </w:pPr>
+      <w:r>
+        <w:rPr>
+          <w:rFonts w:ascii="Consolas" w:cs="Consolas" w:eastAsia="Malgun Gothic" w:hAnsi="Consolas"/>
+          <w:color w:val="111827"/>
+          <w:sz w:val="17"/>
+          <w:szCs w:val="17"/>
+        </w:rPr>
+        <w:t xml:space="preserve">                                             , '미분류')          AS asset_cls</w:t>
+      </w:r>
+    </w:p>
+    <w:p>
+      <w:pPr>
+        <w:shd w:fill="F3F5F8" w:color="auto" w:val="clear"/>
+        <w:spacing w:after="0" w:before="0" w:line="240"/>
+        <w:ind w:left="120" w:right="120"/>
+      </w:pPr>
+      <w:r>
+        <w:rPr>
+          <w:rFonts w:ascii="Consolas" w:cs="Consolas" w:eastAsia="Malgun Gothic" w:hAnsi="Consolas"/>
+          <w:color w:val="111827"/>
+          <w:sz w:val="17"/>
+          <w:szCs w:val="17"/>
+        </w:rPr>
+        <w:t xml:space="preserve">     , m.ATVT_PGM_FUND_CD                                        AS pgm_cd</w:t>
+      </w:r>
+    </w:p>
+    <w:p>
+      <w:pPr>
+        <w:shd w:fill="F3F5F8" w:color="auto" w:val="clear"/>
+        <w:spacing w:after="0" w:before="0" w:line="240"/>
+        <w:ind w:left="120" w:right="120"/>
+      </w:pPr>
+      <w:r>
+        <w:rPr>
+          <w:rFonts w:ascii="Consolas" w:cs="Consolas" w:eastAsia="Malgun Gothic" w:hAnsi="Consolas"/>
+          <w:color w:val="111827"/>
+          <w:sz w:val="17"/>
+          <w:szCs w:val="17"/>
+        </w:rPr>
+        <w:t xml:space="preserve">     , NVL(UPPER(a.CURR_CD), 'KRW')                              AS ccy</w:t>
+      </w:r>
+    </w:p>
+    <w:p>
+      <w:pPr>
+        <w:shd w:fill="F3F5F8" w:color="auto" w:val="clear"/>
+        <w:spacing w:after="0" w:before="0" w:line="240"/>
+        <w:ind w:left="120" w:right="120"/>
+      </w:pPr>
+      <w:r>
+        <w:rPr>
+          <w:rFonts w:ascii="Consolas" w:cs="Consolas" w:eastAsia="Malgun Gothic" w:hAnsi="Consolas"/>
+          <w:color w:val="111827"/>
+          <w:sz w:val="17"/>
+          <w:szCs w:val="17"/>
+        </w:rPr>
+        <w:t xml:space="preserve">     , a.VNTG_YR                                                 AS vintage_yr</w:t>
       </w:r>
     </w:p>
     <w:p>
@@ -370,7 +370,7 @@
           <w:sz w:val="17"/>
           <w:szCs w:val="17"/>
         </w:rPr>
-        <w:t xml:space="preserve">     , (SELECT q.FUND_CD, MAX(q.AVTV_PGM_CD) AS avtv_pgm_cd</w:t>
+        <w:t xml:space="preserve">     , (SELECT q.FUND_CD, MAX(q.ATVT_PGM_FUND_CD) AS atvt_pgm_fund_cd</w:t>
       </w:r>
     </w:p>
     <w:p>
@@ -1713,7 +1713,7 @@
           <w:sz w:val="17"/>
           <w:szCs w:val="17"/>
         </w:rPr>
-        <w:t xml:space="preserve">print(pd.read_sql("SELECT FUND_CD, AVTV_PGM_CD FROM MAAMC0101DTM WHERE ROWNUM &lt;= 3", conn))</w:t>
+        <w:t xml:space="preserve">print(pd.read_sql("SELECT FUND_CD, ATVT_PGM_FUND_CD FROM MAAMC0101DTM WHERE ROWNUM &lt;= 3", conn))</w:t>
       </w:r>
     </w:p>
     <w:p>

</xml_diff>

<commit_message>
확인 셀에 폴더 맞추기(00) 추가: No module named 'loader' 대응
Co-Authored-By: Claude Opus 5.5 <noreply@anthropic.com>
Claude-Session: https://claude.ai/code/session_01FNjiyZhRgWLtzUkmC9rnkc
</commit_message>
<xml_diff>
--- a/deliver/01_SQL.docx
+++ b/deliver/01_SQL.docx
@@ -1394,6 +1394,150 @@
           <w:szCs w:val="17"/>
         </w:rPr>
         <w:t xml:space="preserve"># 네 파일을 sql/ 에 넣은 뒤 순서대로 실행. 각 셀 결과(출력 그대로)를 보내 주시면 됩니다</w:t>
+      </w:r>
+    </w:p>
+    <w:p>
+      <w:pPr>
+        <w:shd w:fill="F3F5F8" w:color="auto" w:val="clear"/>
+        <w:spacing w:after="0" w:before="0" w:line="240"/>
+        <w:ind w:left="120" w:right="120"/>
+      </w:pPr>
+      <w:r>
+        <w:rPr>
+          <w:rFonts w:ascii="Consolas" w:cs="Consolas" w:eastAsia="Malgun Gothic" w:hAnsi="Consolas"/>
+          <w:color w:val="6B7280"/>
+          <w:sz w:val="17"/>
+          <w:szCs w:val="17"/>
+        </w:rPr>
+        <w:t xml:space="preserve"># 00) 폴더 맞추기: loader.py 가 있는 TPA Dashboard 폴더로 이동 (dash_board.ipynb 안에서 돌리면 필요 없음)</w:t>
+      </w:r>
+    </w:p>
+    <w:p>
+      <w:pPr>
+        <w:shd w:fill="F3F5F8" w:color="auto" w:val="clear"/>
+        <w:spacing w:after="0" w:before="0" w:line="240"/>
+        <w:ind w:left="120" w:right="120"/>
+      </w:pPr>
+      <w:r>
+        <w:rPr>
+          <w:rFonts w:ascii="Consolas" w:cs="Consolas" w:eastAsia="Malgun Gothic" w:hAnsi="Consolas"/>
+          <w:color w:val="111827"/>
+          <w:sz w:val="17"/>
+          <w:szCs w:val="17"/>
+        </w:rPr>
+        <w:t xml:space="preserve">import os, sys</w:t>
+      </w:r>
+    </w:p>
+    <w:p>
+      <w:pPr>
+        <w:shd w:fill="F3F5F8" w:color="auto" w:val="clear"/>
+        <w:spacing w:after="0" w:before="0" w:line="240"/>
+        <w:ind w:left="120" w:right="120"/>
+      </w:pPr>
+      <w:r>
+        <w:rPr>
+          <w:rFonts w:ascii="Consolas" w:cs="Consolas" w:eastAsia="Malgun Gothic" w:hAnsi="Consolas"/>
+          <w:color w:val="111827"/>
+          <w:sz w:val="17"/>
+          <w:szCs w:val="17"/>
+        </w:rPr>
+        <w:t xml:space="preserve">BASE = r"여기에_TPA_Dashboard_폴더_경로"          # 예: r"C:\Users\...\TPA Dashboard"  또는  "/home/.../TPA Dashboard"</w:t>
+      </w:r>
+    </w:p>
+    <w:p>
+      <w:pPr>
+        <w:shd w:fill="F3F5F8" w:color="auto" w:val="clear"/>
+        <w:spacing w:after="0" w:before="0" w:line="240"/>
+        <w:ind w:left="120" w:right="120"/>
+      </w:pPr>
+      <w:r>
+        <w:rPr>
+          <w:rFonts w:ascii="Consolas" w:cs="Consolas" w:eastAsia="Malgun Gothic" w:hAnsi="Consolas"/>
+          <w:color w:val="111827"/>
+          <w:sz w:val="17"/>
+          <w:szCs w:val="17"/>
+        </w:rPr>
+        <w:t xml:space="preserve">if os.path.isdir(BASE):</w:t>
+      </w:r>
+    </w:p>
+    <w:p>
+      <w:pPr>
+        <w:shd w:fill="F3F5F8" w:color="auto" w:val="clear"/>
+        <w:spacing w:after="0" w:before="0" w:line="240"/>
+        <w:ind w:left="120" w:right="120"/>
+      </w:pPr>
+      <w:r>
+        <w:rPr>
+          <w:rFonts w:ascii="Consolas" w:cs="Consolas" w:eastAsia="Malgun Gothic" w:hAnsi="Consolas"/>
+          <w:color w:val="111827"/>
+          <w:sz w:val="17"/>
+          <w:szCs w:val="17"/>
+        </w:rPr>
+        <w:t xml:space="preserve">    os.chdir(BASE)</w:t>
+      </w:r>
+    </w:p>
+    <w:p>
+      <w:pPr>
+        <w:shd w:fill="F3F5F8" w:color="auto" w:val="clear"/>
+        <w:spacing w:after="0" w:before="0" w:line="240"/>
+        <w:ind w:left="120" w:right="120"/>
+      </w:pPr>
+      <w:r>
+        <w:rPr>
+          <w:rFonts w:ascii="Consolas" w:cs="Consolas" w:eastAsia="Malgun Gothic" w:hAnsi="Consolas"/>
+          <w:color w:val="111827"/>
+          <w:sz w:val="17"/>
+          <w:szCs w:val="17"/>
+        </w:rPr>
+        <w:t xml:space="preserve">sys.path.insert(0, os.getcwd())</w:t>
+      </w:r>
+    </w:p>
+    <w:p>
+      <w:pPr>
+        <w:shd w:fill="F3F5F8" w:color="auto" w:val="clear"/>
+        <w:spacing w:after="0" w:before="0" w:line="240"/>
+        <w:ind w:left="120" w:right="120"/>
+      </w:pPr>
+      <w:r>
+        <w:rPr>
+          <w:rFonts w:ascii="Consolas" w:cs="Consolas" w:eastAsia="Malgun Gothic" w:hAnsi="Consolas"/>
+          <w:color w:val="111827"/>
+          <w:sz w:val="17"/>
+          <w:szCs w:val="17"/>
+        </w:rPr>
+        <w:t xml:space="preserve">print("현재 폴더:", os.getcwd())</w:t>
+      </w:r>
+    </w:p>
+    <w:p>
+      <w:pPr>
+        <w:shd w:fill="F3F5F8" w:color="auto" w:val="clear"/>
+        <w:spacing w:after="0" w:before="0" w:line="240"/>
+        <w:ind w:left="120" w:right="120"/>
+      </w:pPr>
+      <w:r>
+        <w:rPr>
+          <w:rFonts w:ascii="Consolas" w:cs="Consolas" w:eastAsia="Malgun Gothic" w:hAnsi="Consolas"/>
+          <w:color w:val="111827"/>
+          <w:sz w:val="17"/>
+          <w:szCs w:val="17"/>
+        </w:rPr>
+        <w:t xml:space="preserve">print("loader.py:", os.path.exists("loader.py"), "| sql 폴더:", os.path.isdir("sql"), "| data/ALT_Target.xlsx:", os.path.exists("data/ALT_Target.xlsx"))</w:t>
+      </w:r>
+    </w:p>
+    <w:p>
+      <w:pPr>
+        <w:shd w:fill="F3F5F8" w:color="auto" w:val="clear"/>
+        <w:spacing w:after="0" w:before="0" w:line="240"/>
+        <w:ind w:left="120" w:right="120"/>
+      </w:pPr>
+      <w:r>
+        <w:rPr>
+          <w:rFonts w:ascii="Consolas" w:cs="Consolas" w:eastAsia="Malgun Gothic" w:hAnsi="Consolas"/>
+          <w:color w:val="111827"/>
+          <w:sz w:val="17"/>
+          <w:szCs w:val="17"/>
+        </w:rPr>
+        <w:t xml:space="preserve"> </w:t>
       </w:r>
     </w:p>
     <w:p>
@@ -2487,6 +2631,24 @@
           <w:szCs w:val="20"/>
         </w:rPr>
         <w:t xml:space="preserve">오류가 나면 0) 셀 출력을 그대로 보내 주세요. 오류 위치 앞뒤 글자가 찍혀서 원인 줄을 바로 짚을 수 있습니다</w:t>
+      </w:r>
+    </w:p>
+    <w:p>
+      <w:pPr>
+        <w:pStyle w:val="ListParagraph"/>
+        <w:numPr>
+          <w:ilvl w:val="0"/>
+          <w:numId w:val="2"/>
+        </w:numPr>
+        <w:spacing w:after="60"/>
+      </w:pPr>
+      <w:r>
+        <w:rPr>
+          <w:rFonts w:ascii="Arial" w:cs="Arial" w:eastAsia="Malgun Gothic" w:hAnsi="Arial"/>
+          <w:sz w:val="20"/>
+          <w:szCs w:val="20"/>
+        </w:rPr>
+        <w:t xml:space="preserve">No module named 'loader' 가 나면 00) 의 BASE 를 loader.py 가 있는 폴더로 바꾸세요. 세 개가 모두 True 로 찍혀야 합니다</w:t>
       </w:r>
     </w:p>
     <w:sectPr>

</xml_diff>